<commit_message>
correciones de preguntas, bug del descuento de los puntos y logica de los puntos negativos
</commit_message>
<xml_diff>
--- a/docs/diseno/Diseño.docx
+++ b/docs/diseno/Diseño.docx
@@ -40,11 +40,24 @@
     </w:p>
     <w:p/>
     <w:p>
-      <w:r>
-        <w:t xml:space="preserve">Link de el </w:t>
-      </w:r>
-      <w:r>
-        <w:t xml:space="preserve">boceto en Figma: </w:t>
+      <w:proofErr w:type="gramStart"/>
+      <w:r>
+        <w:t>Link</w:t>
+      </w:r>
+      <w:proofErr w:type="gramEnd"/>
+      <w:r>
+        <w:t xml:space="preserve"> de el </w:t>
+      </w:r>
+      <w:r>
+        <w:t xml:space="preserve">boceto en </w:t>
+      </w:r>
+      <w:proofErr w:type="spellStart"/>
+      <w:r>
+        <w:t>Figma</w:t>
+      </w:r>
+      <w:proofErr w:type="spellEnd"/>
+      <w:r>
+        <w:t xml:space="preserve">: </w:t>
       </w:r>
       <w:hyperlink r:id="rId4" w:history="1">
         <w:r>
@@ -58,6 +71,9 @@
     <w:p/>
     <w:p>
       <w:r>
+        <w:rPr>
+          <w:noProof/>
+        </w:rPr>
         <w:drawing>
           <wp:anchor distT="0" distB="0" distL="114300" distR="114300" simplePos="0" relativeHeight="251658240" behindDoc="1" locked="0" layoutInCell="1" allowOverlap="1" wp14:anchorId="397B3404" wp14:editId="5CB94A5E">
             <wp:simplePos x="0" y="0"/>
@@ -120,6 +136,9 @@
     </w:p>
     <w:p>
       <w:r>
+        <w:rPr>
+          <w:noProof/>
+        </w:rPr>
         <w:drawing>
           <wp:inline distT="0" distB="0" distL="0" distR="0" wp14:anchorId="727919C3" wp14:editId="27E558A5">
             <wp:extent cx="2880000" cy="2201874"/>
@@ -159,6 +178,9 @@
     </w:p>
     <w:p>
       <w:r>
+        <w:rPr>
+          <w:noProof/>
+        </w:rPr>
         <w:drawing>
           <wp:anchor distT="0" distB="0" distL="114300" distR="114300" simplePos="0" relativeHeight="251659264" behindDoc="0" locked="0" layoutInCell="1" allowOverlap="1" wp14:anchorId="5C117133" wp14:editId="089BB2DA">
             <wp:simplePos x="0" y="0"/>
@@ -210,6 +232,9 @@
         </w:drawing>
       </w:r>
       <w:r>
+        <w:rPr>
+          <w:noProof/>
+        </w:rPr>
         <w:drawing>
           <wp:inline distT="0" distB="0" distL="0" distR="0" wp14:anchorId="5EA2C68E" wp14:editId="12F4FB82">
             <wp:extent cx="2880000" cy="2207088"/>
@@ -250,6 +275,9 @@
     <w:p/>
     <w:p>
       <w:r>
+        <w:rPr>
+          <w:noProof/>
+        </w:rPr>
         <w:lastRenderedPageBreak/>
         <w:drawing>
           <wp:anchor distT="0" distB="0" distL="114300" distR="114300" simplePos="0" relativeHeight="251660288" behindDoc="0" locked="0" layoutInCell="1" allowOverlap="1" wp14:anchorId="152C3819" wp14:editId="65BFC2A9">
@@ -302,6 +330,9 @@
         </w:drawing>
       </w:r>
       <w:r>
+        <w:rPr>
+          <w:noProof/>
+        </w:rPr>
         <w:drawing>
           <wp:inline distT="0" distB="0" distL="0" distR="0" wp14:anchorId="663CF510" wp14:editId="70789356">
             <wp:extent cx="2880000" cy="2209369"/>
@@ -341,6 +372,9 @@
     </w:p>
     <w:p>
       <w:r>
+        <w:rPr>
+          <w:noProof/>
+        </w:rPr>
         <w:drawing>
           <wp:inline distT="0" distB="0" distL="0" distR="0" wp14:anchorId="67F6BA78" wp14:editId="71744DB3">
             <wp:extent cx="2880000" cy="2210020"/>
@@ -386,6 +420,9 @@
     </w:p>
     <w:p>
       <w:r>
+        <w:rPr>
+          <w:noProof/>
+        </w:rPr>
         <w:lastRenderedPageBreak/>
         <w:drawing>
           <wp:anchor distT="0" distB="0" distL="114300" distR="114300" simplePos="0" relativeHeight="251662336" behindDoc="0" locked="0" layoutInCell="1" allowOverlap="1" wp14:anchorId="612DDC0E" wp14:editId="53BF1754">
@@ -438,6 +475,9 @@
         </w:drawing>
       </w:r>
       <w:r>
+        <w:rPr>
+          <w:noProof/>
+        </w:rPr>
         <w:drawing>
           <wp:anchor distT="0" distB="0" distL="114300" distR="114300" simplePos="0" relativeHeight="251661312" behindDoc="0" locked="0" layoutInCell="1" allowOverlap="1" wp14:anchorId="03436763" wp14:editId="5B58C27C">
             <wp:simplePos x="0" y="0"/>
@@ -489,6 +529,9 @@
         </w:drawing>
       </w:r>
       <w:r>
+        <w:rPr>
+          <w:noProof/>
+        </w:rPr>
         <w:drawing>
           <wp:inline distT="0" distB="0" distL="0" distR="0" wp14:anchorId="5B8F39B3" wp14:editId="07731193">
             <wp:extent cx="1800000" cy="4029921"/>
@@ -528,6 +571,9 @@
     </w:p>
     <w:p>
       <w:r>
+        <w:rPr>
+          <w:noProof/>
+        </w:rPr>
         <w:drawing>
           <wp:anchor distT="0" distB="0" distL="114300" distR="114300" simplePos="0" relativeHeight="251664384" behindDoc="0" locked="0" layoutInCell="1" allowOverlap="1" wp14:anchorId="3D009C5F" wp14:editId="1488BA90">
             <wp:simplePos x="0" y="0"/>
@@ -579,6 +625,9 @@
         </w:drawing>
       </w:r>
       <w:r>
+        <w:rPr>
+          <w:noProof/>
+        </w:rPr>
         <w:drawing>
           <wp:anchor distT="0" distB="0" distL="114300" distR="114300" simplePos="0" relativeHeight="251663360" behindDoc="0" locked="0" layoutInCell="1" allowOverlap="1" wp14:anchorId="482FDD69" wp14:editId="6401D1D1">
             <wp:simplePos x="0" y="0"/>
@@ -630,6 +679,9 @@
         </w:drawing>
       </w:r>
       <w:r>
+        <w:rPr>
+          <w:noProof/>
+        </w:rPr>
         <w:drawing>
           <wp:inline distT="0" distB="0" distL="0" distR="0" wp14:anchorId="741712DF" wp14:editId="343BEB8D">
             <wp:extent cx="1800000" cy="4000524"/>
@@ -669,9 +721,12 @@
     </w:p>
     <w:p>
       <w:r>
+        <w:rPr>
+          <w:noProof/>
+        </w:rPr>
         <w:lastRenderedPageBreak/>
         <w:drawing>
-          <wp:inline distT="0" distB="0" distL="0" distR="0" wp14:anchorId="39582B0C" wp14:editId="2E8AAF39">
+          <wp:inline distT="0" distB="0" distL="0" distR="0" wp14:anchorId="39582B0C" wp14:editId="76566A1C">
             <wp:extent cx="1800000" cy="4012499"/>
             <wp:effectExtent l="0" t="0" r="0" b="7620"/>
             <wp:docPr id="2129936776" name="Imagen 1"/>
@@ -695,6 +750,668 @@
                     <a:xfrm>
                       <a:off x="0" y="0"/>
                       <a:ext cx="1800000" cy="4012499"/>
+                    </a:xfrm>
+                    <a:prstGeom prst="rect">
+                      <a:avLst/>
+                    </a:prstGeom>
+                  </pic:spPr>
+                </pic:pic>
+              </a:graphicData>
+            </a:graphic>
+          </wp:inline>
+        </w:drawing>
+      </w:r>
+    </w:p>
+    <w:p/>
+    <w:p>
+      <w:r>
+        <w:t>Vistas de alta fidelidad:</w:t>
+      </w:r>
+    </w:p>
+    <w:p>
+      <w:r>
+        <w:drawing>
+          <wp:anchor distT="0" distB="0" distL="114300" distR="114300" simplePos="0" relativeHeight="251665408" behindDoc="0" locked="0" layoutInCell="1" allowOverlap="1" wp14:anchorId="34550D08" wp14:editId="2A73BA5D">
+            <wp:simplePos x="0" y="0"/>
+            <wp:positionH relativeFrom="margin">
+              <wp:align>right</wp:align>
+            </wp:positionH>
+            <wp:positionV relativeFrom="paragraph">
+              <wp:posOffset>10556</wp:posOffset>
+            </wp:positionV>
+            <wp:extent cx="2880000" cy="2220944"/>
+            <wp:effectExtent l="0" t="0" r="0" b="8255"/>
+            <wp:wrapSquare wrapText="bothSides"/>
+            <wp:docPr id="591294233" name="Imagen 1"/>
+            <wp:cNvGraphicFramePr>
+              <a:graphicFrameLocks xmlns:a="http://schemas.openxmlformats.org/drawingml/2006/main" noChangeAspect="1"/>
+            </wp:cNvGraphicFramePr>
+            <a:graphic xmlns:a="http://schemas.openxmlformats.org/drawingml/2006/main">
+              <a:graphicData uri="http://schemas.openxmlformats.org/drawingml/2006/picture">
+                <pic:pic xmlns:pic="http://schemas.openxmlformats.org/drawingml/2006/picture">
+                  <pic:nvPicPr>
+                    <pic:cNvPr id="591294233" name=""/>
+                    <pic:cNvPicPr/>
+                  </pic:nvPicPr>
+                  <pic:blipFill>
+                    <a:blip r:embed="rId19" cstate="print">
+                      <a:extLst>
+                        <a:ext uri="{28A0092B-C50C-407E-A947-70E740481C1C}">
+                          <a14:useLocalDpi xmlns:a14="http://schemas.microsoft.com/office/drawing/2010/main" val="0"/>
+                        </a:ext>
+                      </a:extLst>
+                    </a:blip>
+                    <a:stretch>
+                      <a:fillRect/>
+                    </a:stretch>
+                  </pic:blipFill>
+                  <pic:spPr>
+                    <a:xfrm>
+                      <a:off x="0" y="0"/>
+                      <a:ext cx="2880000" cy="2220944"/>
+                    </a:xfrm>
+                    <a:prstGeom prst="rect">
+                      <a:avLst/>
+                    </a:prstGeom>
+                  </pic:spPr>
+                </pic:pic>
+              </a:graphicData>
+            </a:graphic>
+          </wp:anchor>
+        </w:drawing>
+      </w:r>
+      <w:r>
+        <w:drawing>
+          <wp:inline distT="0" distB="0" distL="0" distR="0" wp14:anchorId="73C4413E" wp14:editId="1863ABF1">
+            <wp:extent cx="2880000" cy="2228294"/>
+            <wp:effectExtent l="0" t="0" r="0" b="635"/>
+            <wp:docPr id="1163438034" name="Imagen 1"/>
+            <wp:cNvGraphicFramePr>
+              <a:graphicFrameLocks xmlns:a="http://schemas.openxmlformats.org/drawingml/2006/main" noChangeAspect="1"/>
+            </wp:cNvGraphicFramePr>
+            <a:graphic xmlns:a="http://schemas.openxmlformats.org/drawingml/2006/main">
+              <a:graphicData uri="http://schemas.openxmlformats.org/drawingml/2006/picture">
+                <pic:pic xmlns:pic="http://schemas.openxmlformats.org/drawingml/2006/picture">
+                  <pic:nvPicPr>
+                    <pic:cNvPr id="1163438034" name=""/>
+                    <pic:cNvPicPr/>
+                  </pic:nvPicPr>
+                  <pic:blipFill>
+                    <a:blip r:embed="rId20"/>
+                    <a:stretch>
+                      <a:fillRect/>
+                    </a:stretch>
+                  </pic:blipFill>
+                  <pic:spPr>
+                    <a:xfrm>
+                      <a:off x="0" y="0"/>
+                      <a:ext cx="2880000" cy="2228294"/>
+                    </a:xfrm>
+                    <a:prstGeom prst="rect">
+                      <a:avLst/>
+                    </a:prstGeom>
+                  </pic:spPr>
+                </pic:pic>
+              </a:graphicData>
+            </a:graphic>
+          </wp:inline>
+        </w:drawing>
+      </w:r>
+    </w:p>
+    <w:p/>
+    <w:p>
+      <w:r>
+        <w:lastRenderedPageBreak/>
+        <w:drawing>
+          <wp:anchor distT="0" distB="0" distL="114300" distR="114300" simplePos="0" relativeHeight="251666432" behindDoc="0" locked="0" layoutInCell="1" allowOverlap="1" wp14:anchorId="61767706" wp14:editId="3A7B6237">
+            <wp:simplePos x="0" y="0"/>
+            <wp:positionH relativeFrom="margin">
+              <wp:align>right</wp:align>
+            </wp:positionH>
+            <wp:positionV relativeFrom="paragraph">
+              <wp:posOffset>15875</wp:posOffset>
+            </wp:positionV>
+            <wp:extent cx="2880000" cy="2193075"/>
+            <wp:effectExtent l="0" t="0" r="0" b="0"/>
+            <wp:wrapSquare wrapText="bothSides"/>
+            <wp:docPr id="1246776564" name="Imagen 1"/>
+            <wp:cNvGraphicFramePr>
+              <a:graphicFrameLocks xmlns:a="http://schemas.openxmlformats.org/drawingml/2006/main" noChangeAspect="1"/>
+            </wp:cNvGraphicFramePr>
+            <a:graphic xmlns:a="http://schemas.openxmlformats.org/drawingml/2006/main">
+              <a:graphicData uri="http://schemas.openxmlformats.org/drawingml/2006/picture">
+                <pic:pic xmlns:pic="http://schemas.openxmlformats.org/drawingml/2006/picture">
+                  <pic:nvPicPr>
+                    <pic:cNvPr id="1246776564" name=""/>
+                    <pic:cNvPicPr/>
+                  </pic:nvPicPr>
+                  <pic:blipFill>
+                    <a:blip r:embed="rId21" cstate="print">
+                      <a:extLst>
+                        <a:ext uri="{28A0092B-C50C-407E-A947-70E740481C1C}">
+                          <a14:useLocalDpi xmlns:a14="http://schemas.microsoft.com/office/drawing/2010/main" val="0"/>
+                        </a:ext>
+                      </a:extLst>
+                    </a:blip>
+                    <a:stretch>
+                      <a:fillRect/>
+                    </a:stretch>
+                  </pic:blipFill>
+                  <pic:spPr>
+                    <a:xfrm>
+                      <a:off x="0" y="0"/>
+                      <a:ext cx="2880000" cy="2193075"/>
+                    </a:xfrm>
+                    <a:prstGeom prst="rect">
+                      <a:avLst/>
+                    </a:prstGeom>
+                  </pic:spPr>
+                </pic:pic>
+              </a:graphicData>
+            </a:graphic>
+          </wp:anchor>
+        </w:drawing>
+      </w:r>
+      <w:r>
+        <w:drawing>
+          <wp:inline distT="0" distB="0" distL="0" distR="0" wp14:anchorId="39C5205F" wp14:editId="092A88B8">
+            <wp:extent cx="2880000" cy="2201038"/>
+            <wp:effectExtent l="0" t="0" r="0" b="8890"/>
+            <wp:docPr id="1059940018" name="Imagen 1"/>
+            <wp:cNvGraphicFramePr>
+              <a:graphicFrameLocks xmlns:a="http://schemas.openxmlformats.org/drawingml/2006/main" noChangeAspect="1"/>
+            </wp:cNvGraphicFramePr>
+            <a:graphic xmlns:a="http://schemas.openxmlformats.org/drawingml/2006/main">
+              <a:graphicData uri="http://schemas.openxmlformats.org/drawingml/2006/picture">
+                <pic:pic xmlns:pic="http://schemas.openxmlformats.org/drawingml/2006/picture">
+                  <pic:nvPicPr>
+                    <pic:cNvPr id="1059940018" name=""/>
+                    <pic:cNvPicPr/>
+                  </pic:nvPicPr>
+                  <pic:blipFill>
+                    <a:blip r:embed="rId22"/>
+                    <a:stretch>
+                      <a:fillRect/>
+                    </a:stretch>
+                  </pic:blipFill>
+                  <pic:spPr>
+                    <a:xfrm>
+                      <a:off x="0" y="0"/>
+                      <a:ext cx="2880000" cy="2201038"/>
+                    </a:xfrm>
+                    <a:prstGeom prst="rect">
+                      <a:avLst/>
+                    </a:prstGeom>
+                  </pic:spPr>
+                </pic:pic>
+              </a:graphicData>
+            </a:graphic>
+          </wp:inline>
+        </w:drawing>
+      </w:r>
+    </w:p>
+    <w:p/>
+    <w:p>
+      <w:r>
+        <w:drawing>
+          <wp:anchor distT="0" distB="0" distL="114300" distR="114300" simplePos="0" relativeHeight="251667456" behindDoc="0" locked="0" layoutInCell="1" allowOverlap="1" wp14:anchorId="35534020" wp14:editId="1E6C440D">
+            <wp:simplePos x="0" y="0"/>
+            <wp:positionH relativeFrom="margin">
+              <wp:align>right</wp:align>
+            </wp:positionH>
+            <wp:positionV relativeFrom="paragraph">
+              <wp:posOffset>16510</wp:posOffset>
+            </wp:positionV>
+            <wp:extent cx="2879725" cy="2207895"/>
+            <wp:effectExtent l="0" t="0" r="0" b="1905"/>
+            <wp:wrapSquare wrapText="bothSides"/>
+            <wp:docPr id="2034882817" name="Imagen 1"/>
+            <wp:cNvGraphicFramePr>
+              <a:graphicFrameLocks xmlns:a="http://schemas.openxmlformats.org/drawingml/2006/main" noChangeAspect="1"/>
+            </wp:cNvGraphicFramePr>
+            <a:graphic xmlns:a="http://schemas.openxmlformats.org/drawingml/2006/main">
+              <a:graphicData uri="http://schemas.openxmlformats.org/drawingml/2006/picture">
+                <pic:pic xmlns:pic="http://schemas.openxmlformats.org/drawingml/2006/picture">
+                  <pic:nvPicPr>
+                    <pic:cNvPr id="2034882817" name=""/>
+                    <pic:cNvPicPr/>
+                  </pic:nvPicPr>
+                  <pic:blipFill>
+                    <a:blip r:embed="rId23" cstate="print">
+                      <a:extLst>
+                        <a:ext uri="{28A0092B-C50C-407E-A947-70E740481C1C}">
+                          <a14:useLocalDpi xmlns:a14="http://schemas.microsoft.com/office/drawing/2010/main" val="0"/>
+                        </a:ext>
+                      </a:extLst>
+                    </a:blip>
+                    <a:stretch>
+                      <a:fillRect/>
+                    </a:stretch>
+                  </pic:blipFill>
+                  <pic:spPr>
+                    <a:xfrm>
+                      <a:off x="0" y="0"/>
+                      <a:ext cx="2879725" cy="2207895"/>
+                    </a:xfrm>
+                    <a:prstGeom prst="rect">
+                      <a:avLst/>
+                    </a:prstGeom>
+                  </pic:spPr>
+                </pic:pic>
+              </a:graphicData>
+            </a:graphic>
+          </wp:anchor>
+        </w:drawing>
+      </w:r>
+      <w:r>
+        <w:drawing>
+          <wp:inline distT="0" distB="0" distL="0" distR="0" wp14:anchorId="1BB642FB" wp14:editId="516324A1">
+            <wp:extent cx="2880000" cy="2220638"/>
+            <wp:effectExtent l="0" t="0" r="0" b="8255"/>
+            <wp:docPr id="119963810" name="Imagen 1"/>
+            <wp:cNvGraphicFramePr>
+              <a:graphicFrameLocks xmlns:a="http://schemas.openxmlformats.org/drawingml/2006/main" noChangeAspect="1"/>
+            </wp:cNvGraphicFramePr>
+            <a:graphic xmlns:a="http://schemas.openxmlformats.org/drawingml/2006/main">
+              <a:graphicData uri="http://schemas.openxmlformats.org/drawingml/2006/picture">
+                <pic:pic xmlns:pic="http://schemas.openxmlformats.org/drawingml/2006/picture">
+                  <pic:nvPicPr>
+                    <pic:cNvPr id="119963810" name=""/>
+                    <pic:cNvPicPr/>
+                  </pic:nvPicPr>
+                  <pic:blipFill>
+                    <a:blip r:embed="rId24"/>
+                    <a:stretch>
+                      <a:fillRect/>
+                    </a:stretch>
+                  </pic:blipFill>
+                  <pic:spPr>
+                    <a:xfrm>
+                      <a:off x="0" y="0"/>
+                      <a:ext cx="2880000" cy="2220638"/>
+                    </a:xfrm>
+                    <a:prstGeom prst="rect">
+                      <a:avLst/>
+                    </a:prstGeom>
+                  </pic:spPr>
+                </pic:pic>
+              </a:graphicData>
+            </a:graphic>
+          </wp:inline>
+        </w:drawing>
+      </w:r>
+    </w:p>
+    <w:p/>
+    <w:p>
+      <w:r>
+        <w:drawing>
+          <wp:inline distT="0" distB="0" distL="0" distR="0" wp14:anchorId="35C699B3" wp14:editId="381A65FA">
+            <wp:extent cx="2880000" cy="2219413"/>
+            <wp:effectExtent l="0" t="0" r="0" b="0"/>
+            <wp:docPr id="1922407562" name="Imagen 1"/>
+            <wp:cNvGraphicFramePr>
+              <a:graphicFrameLocks xmlns:a="http://schemas.openxmlformats.org/drawingml/2006/main" noChangeAspect="1"/>
+            </wp:cNvGraphicFramePr>
+            <a:graphic xmlns:a="http://schemas.openxmlformats.org/drawingml/2006/main">
+              <a:graphicData uri="http://schemas.openxmlformats.org/drawingml/2006/picture">
+                <pic:pic xmlns:pic="http://schemas.openxmlformats.org/drawingml/2006/picture">
+                  <pic:nvPicPr>
+                    <pic:cNvPr id="1922407562" name=""/>
+                    <pic:cNvPicPr/>
+                  </pic:nvPicPr>
+                  <pic:blipFill>
+                    <a:blip r:embed="rId25"/>
+                    <a:stretch>
+                      <a:fillRect/>
+                    </a:stretch>
+                  </pic:blipFill>
+                  <pic:spPr>
+                    <a:xfrm>
+                      <a:off x="0" y="0"/>
+                      <a:ext cx="2880000" cy="2219413"/>
+                    </a:xfrm>
+                    <a:prstGeom prst="rect">
+                      <a:avLst/>
+                    </a:prstGeom>
+                  </pic:spPr>
+                </pic:pic>
+              </a:graphicData>
+            </a:graphic>
+          </wp:inline>
+        </w:drawing>
+      </w:r>
+    </w:p>
+    <w:p>
+      <w:r>
+        <w:lastRenderedPageBreak/>
+        <w:drawing>
+          <wp:anchor distT="0" distB="0" distL="114300" distR="114300" simplePos="0" relativeHeight="251669504" behindDoc="0" locked="0" layoutInCell="1" allowOverlap="1" wp14:anchorId="300818E9" wp14:editId="304E339D">
+            <wp:simplePos x="0" y="0"/>
+            <wp:positionH relativeFrom="margin">
+              <wp:align>right</wp:align>
+            </wp:positionH>
+            <wp:positionV relativeFrom="paragraph">
+              <wp:posOffset>0</wp:posOffset>
+            </wp:positionV>
+            <wp:extent cx="1800000" cy="3875294"/>
+            <wp:effectExtent l="0" t="0" r="0" b="0"/>
+            <wp:wrapSquare wrapText="bothSides"/>
+            <wp:docPr id="1861805016" name="Imagen 1"/>
+            <wp:cNvGraphicFramePr>
+              <a:graphicFrameLocks xmlns:a="http://schemas.openxmlformats.org/drawingml/2006/main" noChangeAspect="1"/>
+            </wp:cNvGraphicFramePr>
+            <a:graphic xmlns:a="http://schemas.openxmlformats.org/drawingml/2006/main">
+              <a:graphicData uri="http://schemas.openxmlformats.org/drawingml/2006/picture">
+                <pic:pic xmlns:pic="http://schemas.openxmlformats.org/drawingml/2006/picture">
+                  <pic:nvPicPr>
+                    <pic:cNvPr id="1861805016" name=""/>
+                    <pic:cNvPicPr/>
+                  </pic:nvPicPr>
+                  <pic:blipFill>
+                    <a:blip r:embed="rId26">
+                      <a:extLst>
+                        <a:ext uri="{28A0092B-C50C-407E-A947-70E740481C1C}">
+                          <a14:useLocalDpi xmlns:a14="http://schemas.microsoft.com/office/drawing/2010/main" val="0"/>
+                        </a:ext>
+                      </a:extLst>
+                    </a:blip>
+                    <a:stretch>
+                      <a:fillRect/>
+                    </a:stretch>
+                  </pic:blipFill>
+                  <pic:spPr>
+                    <a:xfrm>
+                      <a:off x="0" y="0"/>
+                      <a:ext cx="1800000" cy="3875294"/>
+                    </a:xfrm>
+                    <a:prstGeom prst="rect">
+                      <a:avLst/>
+                    </a:prstGeom>
+                  </pic:spPr>
+                </pic:pic>
+              </a:graphicData>
+            </a:graphic>
+          </wp:anchor>
+        </w:drawing>
+      </w:r>
+      <w:r>
+        <w:drawing>
+          <wp:anchor distT="0" distB="0" distL="114300" distR="114300" simplePos="0" relativeHeight="251668480" behindDoc="0" locked="0" layoutInCell="1" allowOverlap="1" wp14:anchorId="0F4FF145" wp14:editId="2FAF8211">
+            <wp:simplePos x="0" y="0"/>
+            <wp:positionH relativeFrom="margin">
+              <wp:align>center</wp:align>
+            </wp:positionH>
+            <wp:positionV relativeFrom="paragraph">
+              <wp:posOffset>13970</wp:posOffset>
+            </wp:positionV>
+            <wp:extent cx="1800000" cy="3963254"/>
+            <wp:effectExtent l="0" t="0" r="0" b="0"/>
+            <wp:wrapSquare wrapText="bothSides"/>
+            <wp:docPr id="1483290181" name="Imagen 1"/>
+            <wp:cNvGraphicFramePr>
+              <a:graphicFrameLocks xmlns:a="http://schemas.openxmlformats.org/drawingml/2006/main" noChangeAspect="1"/>
+            </wp:cNvGraphicFramePr>
+            <a:graphic xmlns:a="http://schemas.openxmlformats.org/drawingml/2006/main">
+              <a:graphicData uri="http://schemas.openxmlformats.org/drawingml/2006/picture">
+                <pic:pic xmlns:pic="http://schemas.openxmlformats.org/drawingml/2006/picture">
+                  <pic:nvPicPr>
+                    <pic:cNvPr id="1483290181" name=""/>
+                    <pic:cNvPicPr/>
+                  </pic:nvPicPr>
+                  <pic:blipFill>
+                    <a:blip r:embed="rId27">
+                      <a:extLst>
+                        <a:ext uri="{28A0092B-C50C-407E-A947-70E740481C1C}">
+                          <a14:useLocalDpi xmlns:a14="http://schemas.microsoft.com/office/drawing/2010/main" val="0"/>
+                        </a:ext>
+                      </a:extLst>
+                    </a:blip>
+                    <a:stretch>
+                      <a:fillRect/>
+                    </a:stretch>
+                  </pic:blipFill>
+                  <pic:spPr>
+                    <a:xfrm>
+                      <a:off x="0" y="0"/>
+                      <a:ext cx="1800000" cy="3963254"/>
+                    </a:xfrm>
+                    <a:prstGeom prst="rect">
+                      <a:avLst/>
+                    </a:prstGeom>
+                  </pic:spPr>
+                </pic:pic>
+              </a:graphicData>
+            </a:graphic>
+          </wp:anchor>
+        </w:drawing>
+      </w:r>
+      <w:r>
+        <w:drawing>
+          <wp:inline distT="0" distB="0" distL="0" distR="0" wp14:anchorId="30C0B9FD" wp14:editId="2A2E47FC">
+            <wp:extent cx="1800000" cy="3991541"/>
+            <wp:effectExtent l="0" t="0" r="0" b="0"/>
+            <wp:docPr id="551933177" name="Imagen 1"/>
+            <wp:cNvGraphicFramePr>
+              <a:graphicFrameLocks xmlns:a="http://schemas.openxmlformats.org/drawingml/2006/main" noChangeAspect="1"/>
+            </wp:cNvGraphicFramePr>
+            <a:graphic xmlns:a="http://schemas.openxmlformats.org/drawingml/2006/main">
+              <a:graphicData uri="http://schemas.openxmlformats.org/drawingml/2006/picture">
+                <pic:pic xmlns:pic="http://schemas.openxmlformats.org/drawingml/2006/picture">
+                  <pic:nvPicPr>
+                    <pic:cNvPr id="551933177" name=""/>
+                    <pic:cNvPicPr/>
+                  </pic:nvPicPr>
+                  <pic:blipFill>
+                    <a:blip r:embed="rId28"/>
+                    <a:stretch>
+                      <a:fillRect/>
+                    </a:stretch>
+                  </pic:blipFill>
+                  <pic:spPr>
+                    <a:xfrm>
+                      <a:off x="0" y="0"/>
+                      <a:ext cx="1800000" cy="3991541"/>
+                    </a:xfrm>
+                    <a:prstGeom prst="rect">
+                      <a:avLst/>
+                    </a:prstGeom>
+                  </pic:spPr>
+                </pic:pic>
+              </a:graphicData>
+            </a:graphic>
+          </wp:inline>
+        </w:drawing>
+      </w:r>
+    </w:p>
+    <w:p>
+      <w:r>
+        <w:drawing>
+          <wp:anchor distT="0" distB="0" distL="114300" distR="114300" simplePos="0" relativeHeight="251672576" behindDoc="0" locked="0" layoutInCell="1" allowOverlap="1" wp14:anchorId="1297D521" wp14:editId="7BF579EE">
+            <wp:simplePos x="0" y="0"/>
+            <wp:positionH relativeFrom="column">
+              <wp:posOffset>4347845</wp:posOffset>
+            </wp:positionH>
+            <wp:positionV relativeFrom="paragraph">
+              <wp:posOffset>172085</wp:posOffset>
+            </wp:positionV>
+            <wp:extent cx="1800000" cy="3951351"/>
+            <wp:effectExtent l="0" t="0" r="0" b="0"/>
+            <wp:wrapSquare wrapText="bothSides"/>
+            <wp:docPr id="1271967909" name="Imagen 1"/>
+            <wp:cNvGraphicFramePr>
+              <a:graphicFrameLocks xmlns:a="http://schemas.openxmlformats.org/drawingml/2006/main" noChangeAspect="1"/>
+            </wp:cNvGraphicFramePr>
+            <a:graphic xmlns:a="http://schemas.openxmlformats.org/drawingml/2006/main">
+              <a:graphicData uri="http://schemas.openxmlformats.org/drawingml/2006/picture">
+                <pic:pic xmlns:pic="http://schemas.openxmlformats.org/drawingml/2006/picture">
+                  <pic:nvPicPr>
+                    <pic:cNvPr id="1271967909" name=""/>
+                    <pic:cNvPicPr/>
+                  </pic:nvPicPr>
+                  <pic:blipFill>
+                    <a:blip r:embed="rId29">
+                      <a:extLst>
+                        <a:ext uri="{28A0092B-C50C-407E-A947-70E740481C1C}">
+                          <a14:useLocalDpi xmlns:a14="http://schemas.microsoft.com/office/drawing/2010/main" val="0"/>
+                        </a:ext>
+                      </a:extLst>
+                    </a:blip>
+                    <a:stretch>
+                      <a:fillRect/>
+                    </a:stretch>
+                  </pic:blipFill>
+                  <pic:spPr>
+                    <a:xfrm>
+                      <a:off x="0" y="0"/>
+                      <a:ext cx="1800000" cy="3951351"/>
+                    </a:xfrm>
+                    <a:prstGeom prst="rect">
+                      <a:avLst/>
+                    </a:prstGeom>
+                  </pic:spPr>
+                </pic:pic>
+              </a:graphicData>
+            </a:graphic>
+          </wp:anchor>
+        </w:drawing>
+      </w:r>
+    </w:p>
+    <w:p/>
+    <w:p>
+      <w:r>
+        <w:drawing>
+          <wp:anchor distT="0" distB="0" distL="114300" distR="114300" simplePos="0" relativeHeight="251670528" behindDoc="0" locked="0" layoutInCell="1" allowOverlap="1" wp14:anchorId="4938ECD6" wp14:editId="11FC8F0F">
+            <wp:simplePos x="0" y="0"/>
+            <wp:positionH relativeFrom="margin">
+              <wp:align>left</wp:align>
+            </wp:positionH>
+            <wp:positionV relativeFrom="paragraph">
+              <wp:posOffset>-426085</wp:posOffset>
+            </wp:positionV>
+            <wp:extent cx="1800000" cy="3924324"/>
+            <wp:effectExtent l="0" t="0" r="0" b="0"/>
+            <wp:wrapSquare wrapText="bothSides"/>
+            <wp:docPr id="729827711" name="Imagen 1"/>
+            <wp:cNvGraphicFramePr>
+              <a:graphicFrameLocks xmlns:a="http://schemas.openxmlformats.org/drawingml/2006/main" noChangeAspect="1"/>
+            </wp:cNvGraphicFramePr>
+            <a:graphic xmlns:a="http://schemas.openxmlformats.org/drawingml/2006/main">
+              <a:graphicData uri="http://schemas.openxmlformats.org/drawingml/2006/picture">
+                <pic:pic xmlns:pic="http://schemas.openxmlformats.org/drawingml/2006/picture">
+                  <pic:nvPicPr>
+                    <pic:cNvPr id="729827711" name=""/>
+                    <pic:cNvPicPr/>
+                  </pic:nvPicPr>
+                  <pic:blipFill>
+                    <a:blip r:embed="rId30">
+                      <a:extLst>
+                        <a:ext uri="{28A0092B-C50C-407E-A947-70E740481C1C}">
+                          <a14:useLocalDpi xmlns:a14="http://schemas.microsoft.com/office/drawing/2010/main" val="0"/>
+                        </a:ext>
+                      </a:extLst>
+                    </a:blip>
+                    <a:stretch>
+                      <a:fillRect/>
+                    </a:stretch>
+                  </pic:blipFill>
+                  <pic:spPr>
+                    <a:xfrm>
+                      <a:off x="0" y="0"/>
+                      <a:ext cx="1800000" cy="3924324"/>
+                    </a:xfrm>
+                    <a:prstGeom prst="rect">
+                      <a:avLst/>
+                    </a:prstGeom>
+                  </pic:spPr>
+                </pic:pic>
+              </a:graphicData>
+            </a:graphic>
+          </wp:anchor>
+        </w:drawing>
+      </w:r>
+    </w:p>
+    <w:p>
+      <w:r>
+        <w:drawing>
+          <wp:anchor distT="0" distB="0" distL="114300" distR="114300" simplePos="0" relativeHeight="251671552" behindDoc="0" locked="0" layoutInCell="1" allowOverlap="1" wp14:anchorId="494F8AD2" wp14:editId="20242AFE">
+            <wp:simplePos x="0" y="0"/>
+            <wp:positionH relativeFrom="margin">
+              <wp:align>center</wp:align>
+            </wp:positionH>
+            <wp:positionV relativeFrom="paragraph">
+              <wp:posOffset>-782955</wp:posOffset>
+            </wp:positionV>
+            <wp:extent cx="1800000" cy="3964350"/>
+            <wp:effectExtent l="0" t="0" r="0" b="0"/>
+            <wp:wrapSquare wrapText="bothSides"/>
+            <wp:docPr id="901037062" name="Imagen 1"/>
+            <wp:cNvGraphicFramePr>
+              <a:graphicFrameLocks xmlns:a="http://schemas.openxmlformats.org/drawingml/2006/main" noChangeAspect="1"/>
+            </wp:cNvGraphicFramePr>
+            <a:graphic xmlns:a="http://schemas.openxmlformats.org/drawingml/2006/main">
+              <a:graphicData uri="http://schemas.openxmlformats.org/drawingml/2006/picture">
+                <pic:pic xmlns:pic="http://schemas.openxmlformats.org/drawingml/2006/picture">
+                  <pic:nvPicPr>
+                    <pic:cNvPr id="901037062" name=""/>
+                    <pic:cNvPicPr/>
+                  </pic:nvPicPr>
+                  <pic:blipFill>
+                    <a:blip r:embed="rId31">
+                      <a:extLst>
+                        <a:ext uri="{28A0092B-C50C-407E-A947-70E740481C1C}">
+                          <a14:useLocalDpi xmlns:a14="http://schemas.microsoft.com/office/drawing/2010/main" val="0"/>
+                        </a:ext>
+                      </a:extLst>
+                    </a:blip>
+                    <a:stretch>
+                      <a:fillRect/>
+                    </a:stretch>
+                  </pic:blipFill>
+                  <pic:spPr>
+                    <a:xfrm>
+                      <a:off x="0" y="0"/>
+                      <a:ext cx="1800000" cy="3964350"/>
+                    </a:xfrm>
+                    <a:prstGeom prst="rect">
+                      <a:avLst/>
+                    </a:prstGeom>
+                  </pic:spPr>
+                </pic:pic>
+              </a:graphicData>
+            </a:graphic>
+          </wp:anchor>
+        </w:drawing>
+      </w:r>
+    </w:p>
+    <w:p/>
+    <w:p>
+      <w:r>
+        <w:lastRenderedPageBreak/>
+        <w:drawing>
+          <wp:inline distT="0" distB="0" distL="0" distR="0" wp14:anchorId="361BE884" wp14:editId="273E21AB">
+            <wp:extent cx="1800000" cy="3941567"/>
+            <wp:effectExtent l="0" t="0" r="0" b="1905"/>
+            <wp:docPr id="1923513182" name="Imagen 1"/>
+            <wp:cNvGraphicFramePr>
+              <a:graphicFrameLocks xmlns:a="http://schemas.openxmlformats.org/drawingml/2006/main" noChangeAspect="1"/>
+            </wp:cNvGraphicFramePr>
+            <a:graphic xmlns:a="http://schemas.openxmlformats.org/drawingml/2006/main">
+              <a:graphicData uri="http://schemas.openxmlformats.org/drawingml/2006/picture">
+                <pic:pic xmlns:pic="http://schemas.openxmlformats.org/drawingml/2006/picture">
+                  <pic:nvPicPr>
+                    <pic:cNvPr id="1923513182" name=""/>
+                    <pic:cNvPicPr/>
+                  </pic:nvPicPr>
+                  <pic:blipFill>
+                    <a:blip r:embed="rId32"/>
+                    <a:stretch>
+                      <a:fillRect/>
+                    </a:stretch>
+                  </pic:blipFill>
+                  <pic:spPr>
+                    <a:xfrm>
+                      <a:off x="0" y="0"/>
+                      <a:ext cx="1800000" cy="3941567"/>
                     </a:xfrm>
                     <a:prstGeom prst="rect">
                       <a:avLst/>

</xml_diff>